<commit_message>
Small addition mission definition
</commit_message>
<xml_diff>
--- a/Documentation/Requirements and Mission Definition.docx
+++ b/Documentation/Requirements and Mission Definition.docx
@@ -4,7 +4,7 @@
   <w:body>
     <w:p>
       <w:pPr>
-        <w:pStyle w:val="Heading1"/>
+        <w:pStyle w:val="Rubrik1"/>
         <w:jc w:val="center"/>
       </w:pPr>
       <w:r>
@@ -13,7 +13,7 @@
     </w:p>
     <w:p>
       <w:pPr>
-        <w:pStyle w:val="Heading3"/>
+        <w:pStyle w:val="Rubrik3"/>
       </w:pPr>
       <w:r>
         <w:t>Introduction and mission’s purpose</w:t>
@@ -34,7 +34,7 @@
       <w:hyperlink r:id="rId7" w:history="1">
         <w:r>
           <w:rPr>
-            <w:rStyle w:val="Hyperlink"/>
+            <w:rStyle w:val="Hyperlnk"/>
             <w:i/>
             <w:iCs/>
             <w:color w:val="000000" w:themeColor="text1"/>
@@ -145,13 +145,86 @@
           <w:color w:val="000000" w:themeColor="text1"/>
         </w:rPr>
       </w:pPr>
+      <w:r>
+        <w:rPr>
+          <w:color w:val="000000" w:themeColor="text1"/>
+        </w:rPr>
+        <w:t xml:space="preserve">Another slightly different use case for the UAV fleet would be early stage firefighting when new fires </w:t>
+      </w:r>
+      <w:r>
+        <w:rPr>
+          <w:color w:val="000000" w:themeColor="text1"/>
+        </w:rPr>
+        <w:t>are about to begin</w:t>
+      </w:r>
+      <w:r>
+        <w:rPr>
+          <w:color w:val="000000" w:themeColor="text1"/>
+        </w:rPr>
+        <w:t xml:space="preserve">. The UAVs would be able to reach their target in a minimal time and their precise </w:t>
+      </w:r>
+      <w:r>
+        <w:rPr>
+          <w:color w:val="000000" w:themeColor="text1"/>
+        </w:rPr>
+        <w:lastRenderedPageBreak/>
+        <w:t xml:space="preserve">deployment of the </w:t>
+      </w:r>
+      <w:r>
+        <w:rPr>
+          <w:color w:val="000000" w:themeColor="text1"/>
+        </w:rPr>
+        <w:t>dry-powder extinguishing devices</w:t>
+      </w:r>
+      <w:r>
+        <w:rPr>
+          <w:color w:val="000000" w:themeColor="text1"/>
+        </w:rPr>
+        <w:t xml:space="preserve"> could potentially stop the fire before it even really started. </w:t>
+      </w:r>
+      <w:r>
+        <w:rPr>
+          <w:color w:val="000000" w:themeColor="text1"/>
+        </w:rPr>
+        <w:t xml:space="preserve">Like this the fire can be fought much faster than if you would rely on ground crews only, especially if the fire is in a hard to reach location. </w:t>
+      </w:r>
+      <w:r>
+        <w:rPr>
+          <w:color w:val="000000" w:themeColor="text1"/>
+        </w:rPr>
+        <w:t xml:space="preserve">For </w:t>
+      </w:r>
+      <w:r>
+        <w:rPr>
+          <w:color w:val="000000" w:themeColor="text1"/>
+        </w:rPr>
+        <w:t>this strategy to be effective</w:t>
+      </w:r>
+      <w:r>
+        <w:rPr>
+          <w:color w:val="000000" w:themeColor="text1"/>
+        </w:rPr>
+        <w:t xml:space="preserve">, a </w:t>
+      </w:r>
+      <w:r>
+        <w:rPr>
+          <w:color w:val="000000" w:themeColor="text1"/>
+        </w:rPr>
+        <w:t>good infrastructure for detecting forest fires in remote locations would be needed.</w:t>
+      </w:r>
     </w:p>
     <w:p>
       <w:pPr>
-        <w:pStyle w:val="Heading3"/>
-      </w:pPr>
-      <w:r>
-        <w:lastRenderedPageBreak/>
+        <w:rPr>
+          <w:color w:val="000000" w:themeColor="text1"/>
+        </w:rPr>
+      </w:pPr>
+    </w:p>
+    <w:p>
+      <w:pPr>
+        <w:pStyle w:val="Rubrik3"/>
+      </w:pPr>
+      <w:r>
         <w:t>Requirements</w:t>
       </w:r>
     </w:p>
@@ -434,13 +507,14 @@
     </w:p>
     <w:p>
       <w:pPr>
-        <w:pStyle w:val="NormalWeb"/>
+        <w:pStyle w:val="Normalwebb"/>
         <w:ind w:firstLine="360"/>
       </w:pPr>
       <w:r>
         <w:rPr>
           <w:noProof/>
         </w:rPr>
+        <w:lastRenderedPageBreak/>
         <w:drawing>
           <wp:inline distT="0" distB="0" distL="0" distR="0" wp14:anchorId="5B4B3F1E" wp14:editId="1237A3E3">
             <wp:extent cx="5129893" cy="3751979"/>
@@ -514,7 +588,6 @@
           <w:bCs/>
           <w:color w:val="000000" w:themeColor="text1"/>
         </w:rPr>
-        <w:lastRenderedPageBreak/>
         <w:t>Maximum wingspan of 15 m:</w:t>
       </w:r>
       <w:r>
@@ -636,21 +709,7 @@
         <w:rPr>
           <w:color w:val="000000" w:themeColor="text1"/>
         </w:rPr>
-        <w:t xml:space="preserve"> (</w:t>
-      </w:r>
-      <w:proofErr w:type="gramStart"/>
-      <w:r>
-        <w:rPr>
-          <w:color w:val="000000" w:themeColor="text1"/>
-        </w:rPr>
-        <w:t>10 minute</w:t>
-      </w:r>
-      <w:proofErr w:type="gramEnd"/>
-      <w:r>
-        <w:rPr>
-          <w:color w:val="000000" w:themeColor="text1"/>
-        </w:rPr>
-        <w:t xml:space="preserve"> operation)</w:t>
+        <w:t xml:space="preserve"> (10 minute operation)</w:t>
       </w:r>
       <w:r>
         <w:rPr>
@@ -749,6 +808,7 @@
           <w:bCs/>
           <w:color w:val="000000" w:themeColor="text1"/>
         </w:rPr>
+        <w:lastRenderedPageBreak/>
         <w:t>Range:</w:t>
       </w:r>
       <w:r>
@@ -786,7 +846,6 @@
           <w:sz w:val="28"/>
           <w:szCs w:val="28"/>
         </w:rPr>
-        <w:lastRenderedPageBreak/>
         <w:t>Why Choose the Dry-Powder Bomb Method Over Red Powder and Water-Based Firefighting Methods for the UAVs?</w:t>
       </w:r>
     </w:p>
@@ -833,7 +892,7 @@
     </w:p>
     <w:tbl>
       <w:tblPr>
-        <w:tblStyle w:val="TableGrid"/>
+        <w:tblStyle w:val="Tabellrutnt"/>
         <w:tblW w:w="9493" w:type="dxa"/>
         <w:tblLook w:val="04A0" w:firstRow="1" w:lastRow="0" w:firstColumn="1" w:lastColumn="0" w:noHBand="0" w:noVBand="1"/>
       </w:tblPr>
@@ -1319,6 +1378,7 @@
                 <w:b/>
                 <w:bCs/>
               </w:rPr>
+              <w:lastRenderedPageBreak/>
               <w:t>Precision Tolerance</w:t>
             </w:r>
           </w:p>
@@ -1524,7 +1584,6 @@
                 <w:b/>
                 <w:bCs/>
               </w:rPr>
-              <w:lastRenderedPageBreak/>
               <w:t>Suitability for outdoors (wind)</w:t>
             </w:r>
           </w:p>
@@ -1867,6 +1926,9 @@
     <w:p/>
     <w:p>
       <w:r>
+        <w:rPr>
+          <w:noProof/>
+        </w:rPr>
         <mc:AlternateContent>
           <mc:Choice Requires="wps">
             <w:drawing>
@@ -2144,13 +2206,12 @@
           <w:i/>
           <w:iCs/>
         </w:rPr>
-        <w:lastRenderedPageBreak/>
         <w:t>Score Table</w:t>
       </w:r>
     </w:p>
     <w:tbl>
       <w:tblPr>
-        <w:tblStyle w:val="TableGrid"/>
+        <w:tblStyle w:val="Tabellrutnt"/>
         <w:tblW w:w="9067" w:type="dxa"/>
         <w:tblLook w:val="04A0" w:firstRow="1" w:lastRow="0" w:firstColumn="1" w:lastColumn="0" w:noHBand="0" w:noVBand="1"/>
       </w:tblPr>
@@ -2823,6 +2884,7 @@
                 <w:b/>
                 <w:bCs/>
               </w:rPr>
+              <w:lastRenderedPageBreak/>
               <w:t>Environmental impact (2)</w:t>
             </w:r>
           </w:p>
@@ -3243,7 +3305,6 @@
           <w:b/>
           <w:bCs/>
         </w:rPr>
-        <w:lastRenderedPageBreak/>
         <w:t>Red Powder Examples:</w:t>
       </w:r>
     </w:p>
@@ -3257,7 +3318,7 @@
       <w:hyperlink r:id="rId9" w:history="1">
         <w:r>
           <w:rPr>
-            <w:rStyle w:val="Hyperlink"/>
+            <w:rStyle w:val="Hyperlnk"/>
           </w:rPr>
           <w:t>https://www.perimeter-solutions.com/product/phos-chek-259-fx-2/</w:t>
         </w:r>
@@ -3276,7 +3337,7 @@
       <w:hyperlink r:id="rId10" w:history="1">
         <w:r>
           <w:rPr>
-            <w:rStyle w:val="Hyperlink"/>
+            <w:rStyle w:val="Hyperlnk"/>
           </w:rPr>
           <w:t>https://xpyro.fi/</w:t>
         </w:r>
@@ -3311,7 +3372,7 @@
       <w:hyperlink r:id="rId11" w:history="1">
         <w:r>
           <w:rPr>
-            <w:rStyle w:val="Hyperlink"/>
+            <w:rStyle w:val="Hyperlnk"/>
           </w:rPr>
           <w:t>https://jinghongdrone.com/fire-extinguishing-bomb-deployment-device</w:t>
         </w:r>
@@ -3330,7 +3391,7 @@
       <w:hyperlink r:id="rId12" w:history="1">
         <w:r>
           <w:rPr>
-            <w:rStyle w:val="Hyperlink"/>
+            <w:rStyle w:val="Hyperlnk"/>
           </w:rPr>
           <w:t>https://www.youtube.com/shorts/bTtY0pKd4pU</w:t>
         </w:r>
@@ -3352,7 +3413,7 @@
       <w:hyperlink r:id="rId13" w:history="1">
         <w:r>
           <w:rPr>
-            <w:rStyle w:val="Hyperlink"/>
+            <w:rStyle w:val="Hyperlnk"/>
           </w:rPr>
           <w:t>https://salgrom.fi/en/how-does-impulse-dry-powder-fire-suppression-work/</w:t>
         </w:r>
@@ -3385,10 +3446,9 @@
     <w:p/>
     <w:p>
       <w:pPr>
-        <w:pStyle w:val="Heading3"/>
-      </w:pPr>
-      <w:r>
-        <w:lastRenderedPageBreak/>
+        <w:pStyle w:val="Rubrik3"/>
+      </w:pPr>
+      <w:r>
         <w:t>References</w:t>
       </w:r>
     </w:p>
@@ -3400,7 +3460,7 @@
       <w:hyperlink r:id="rId14" w:history="1">
         <w:r>
           <w:rPr>
-            <w:rStyle w:val="Hyperlink"/>
+            <w:rStyle w:val="Hyperlnk"/>
           </w:rPr>
           <w:t>https://forest-fire.emergency.copernicus.eu/apps/effis.statistics/estimates</w:t>
         </w:r>
@@ -3416,7 +3476,7 @@
       <w:hyperlink r:id="rId15" w:history="1">
         <w:r>
           <w:rPr>
-            <w:rStyle w:val="Hyperlink"/>
+            <w:rStyle w:val="Hyperlnk"/>
           </w:rPr>
           <w:t>https://civil-protection-humanitarian-aid.ec.europa.eu/news-stories/stories/helping-greece-tackle-largest-wildfires-century-europe_en</w:t>
         </w:r>
@@ -3438,7 +3498,7 @@
       <w:hyperlink r:id="rId16" w:history="1">
         <w:r>
           <w:rPr>
-            <w:rStyle w:val="Hyperlink"/>
+            <w:rStyle w:val="Hyperlnk"/>
           </w:rPr>
           <w:t>https://www.google.com/url?sa=i&amp;source=web&amp;rct=j&amp;url=/goto?url%3DCAESlgEB6zswFaW6jig_nAzX5a_wuSaun9QoBNS2FJNdq4DhdCqCsjF2YeGIPwS30PeL7lgwNpzXbBMquxrUHsJ1aPgX7LqV9FkTJmAQVq-u6UTnTqVSLL_fguXw6LhQijW65jju9XBnDlppdOvEpJsm8bgwboF16mUq8fn1g9E8_LpZjDJF-7ScNL422HSru0BzK4vkxFvbdXI&amp;ved=2ahUKEwiqssbbkIOXAxVdHhAIHW0QHMQQqYcPegYIAAgnEAI&amp;opi=89978449&amp;cd&amp;psig=AOvVaw0KnjIk9wtdBAUFHfSz9hOf&amp;ust=1790198896298000</w:t>
         </w:r>
@@ -3462,7 +3522,7 @@
       <w:hyperlink r:id="rId17" w:history="1">
         <w:r>
           <w:rPr>
-            <w:rStyle w:val="Hyperlink"/>
+            <w:rStyle w:val="Hyperlnk"/>
           </w:rPr>
           <w:t>https://jinghongdrone.com/uav-for-fire-fighting-key-technologies-and-features-explained</w:t>
         </w:r>
@@ -3486,7 +3546,7 @@
       <w:hyperlink r:id="rId18" w:history="1">
         <w:r>
           <w:rPr>
-            <w:rStyle w:val="Hyperlink"/>
+            <w:rStyle w:val="Hyperlnk"/>
           </w:rPr>
           <w:t>https://wmpllc.org/ojs/index.php/jem/article/view/2689</w:t>
         </w:r>
@@ -3510,7 +3570,7 @@
       <w:hyperlink r:id="rId19" w:history="1">
         <w:r>
           <w:rPr>
-            <w:rStyle w:val="Hyperlink"/>
+            <w:rStyle w:val="Hyperlnk"/>
           </w:rPr>
           <w:t>https://www.fs.usda.gov/t-d/pubs/pdfpubs/pdf00572851/pdf00572851_72dpi.pdf</w:t>
         </w:r>
@@ -3518,6 +3578,7 @@
     </w:p>
     <w:p>
       <w:r>
+        <w:lastRenderedPageBreak/>
         <w:t>[</w:t>
       </w:r>
       <w:r>
@@ -3531,7 +3592,7 @@
       <w:hyperlink r:id="rId20" w:history="1">
         <w:r>
           <w:rPr>
-            <w:rStyle w:val="Hyperlink"/>
+            <w:rStyle w:val="Hyperlnk"/>
           </w:rPr>
           <w:t>https://en.wikipedia.org/wiki/Canadair_CL-415</w:t>
         </w:r>
@@ -3596,7 +3657,7 @@
     <w:sdtContent>
       <w:p>
         <w:pPr>
-          <w:pStyle w:val="Footer"/>
+          <w:pStyle w:val="Sidfot"/>
           <w:jc w:val="center"/>
         </w:pPr>
         <w:r>
@@ -3625,7 +3686,7 @@
   </w:sdt>
   <w:p>
     <w:pPr>
-      <w:pStyle w:val="Footer"/>
+      <w:pStyle w:val="Sidfot"/>
     </w:pPr>
   </w:p>
 </w:ftr>
@@ -3660,7 +3721,7 @@
 <w:hdr xmlns:wpc="http://schemas.microsoft.com/office/word/2010/wordprocessingCanvas" xmlns:cx="http://schemas.microsoft.com/office/drawing/2014/chartex" xmlns:cx1="http://schemas.microsoft.com/office/drawing/2015/9/8/chartex" xmlns:cx2="http://schemas.microsoft.com/office/drawing/2015/10/21/chartex" xmlns:cx3="http://schemas.microsoft.com/office/drawing/2016/5/9/chartex" xmlns:cx4="http://schemas.microsoft.com/office/drawing/2016/5/10/chartex" xmlns:cx5="http://schemas.microsoft.com/office/drawing/2016/5/11/chartex" xmlns:cx6="http://schemas.microsoft.com/office/drawing/2016/5/12/chartex" xmlns:cx7="http://schemas.microsoft.com/office/drawing/2016/5/13/chartex" xmlns:cx8="http://schemas.microsoft.com/office/drawing/2016/5/14/chartex" xmlns:mc="http://schemas.openxmlformats.org/markup-compatibility/2006" xmlns:aink="http://schemas.microsoft.com/office/drawing/2016/ink" xmlns:am3d="http://schemas.microsoft.com/office/drawing/2017/model3d" xmlns:o="urn:schemas-microsoft-com:office:office" xmlns:oel="http://schemas.microsoft.com/office/2019/extlst" xmlns:r="http://schemas.openxmlformats.org/officeDocument/2006/relationships" xmlns:m="http://schemas.openxmlformats.org/officeDocument/2006/math" xmlns:v="urn:schemas-microsoft-com:vml" xmlns:wp14="http://schemas.microsoft.com/office/word/2010/wordprocessingDrawing" xmlns:wp="http://schemas.openxmlformats.org/drawingml/2006/wordprocessingDrawing" xmlns:w10="urn:schemas-microsoft-com:office:word" xmlns:w="http://schemas.openxmlformats.org/wordprocessingml/2006/main" xmlns:w14="http://schemas.microsoft.com/office/word/2010/wordml" xmlns:w15="http://schemas.microsoft.com/office/word/2012/wordml" xmlns:w16cex="http://schemas.microsoft.com/office/word/2018/wordml/cex" xmlns:w16cid="http://schemas.microsoft.com/office/word/2016/wordml/cid" xmlns:w16="http://schemas.microsoft.com/office/word/2018/wordml" xmlns:w16du="http://schemas.microsoft.com/office/word/2023/wordml/word16du" xmlns:w16sdtdh="http://schemas.microsoft.com/office/word/2020/wordml/sdtdatahash" xmlns:w16sdtfl="http://schemas.microsoft.com/office/word/2024/wordml/sdtformatlock" xmlns:w16se="http://schemas.microsoft.com/office/word/2015/wordml/symex" xmlns:wpg="http://schemas.microsoft.com/office/word/2010/wordprocessingGroup" xmlns:wpi="http://schemas.microsoft.com/office/word/2010/wordprocessingInk" xmlns:wne="http://schemas.microsoft.com/office/word/2006/wordml" xmlns:wps="http://schemas.microsoft.com/office/word/2010/wordprocessingShape" mc:Ignorable="w14 w15 w16se w16cid w16 w16cex w16sdtdh w16sdtfl w16du wp14">
   <w:p>
     <w:pPr>
-      <w:pStyle w:val="Header"/>
+      <w:pStyle w:val="Sidhuvud"/>
     </w:pPr>
     <w:r>
       <w:t xml:space="preserve">Team 1 </w:t>
@@ -3671,8 +3732,6 @@
     </w:r>
     <w:r>
       <w:tab/>
-    </w:r>
-    <w:r>
       <w:t xml:space="preserve">Aero </w:t>
     </w:r>
     <w:r>
@@ -4186,27 +4245,9 @@
   </w:num>
   <w:num w:numId="2" w16cid:durableId="244343648">
     <w:abstractNumId w:val="1"/>
-    <w:lvlOverride w:ilvl="0"/>
-    <w:lvlOverride w:ilvl="1"/>
-    <w:lvlOverride w:ilvl="2"/>
-    <w:lvlOverride w:ilvl="3"/>
-    <w:lvlOverride w:ilvl="4"/>
-    <w:lvlOverride w:ilvl="5"/>
-    <w:lvlOverride w:ilvl="6"/>
-    <w:lvlOverride w:ilvl="7"/>
-    <w:lvlOverride w:ilvl="8"/>
   </w:num>
   <w:num w:numId="3" w16cid:durableId="954872726">
     <w:abstractNumId w:val="2"/>
-    <w:lvlOverride w:ilvl="0"/>
-    <w:lvlOverride w:ilvl="1"/>
-    <w:lvlOverride w:ilvl="2"/>
-    <w:lvlOverride w:ilvl="3"/>
-    <w:lvlOverride w:ilvl="4"/>
-    <w:lvlOverride w:ilvl="5"/>
-    <w:lvlOverride w:ilvl="6"/>
-    <w:lvlOverride w:ilvl="7"/>
-    <w:lvlOverride w:ilvl="8"/>
   </w:num>
   <w:num w:numId="4" w16cid:durableId="791442887">
     <w:abstractNumId w:val="3"/>
@@ -4615,11 +4656,11 @@
     <w:name w:val="Normal"/>
     <w:qFormat/>
   </w:style>
-  <w:style w:type="paragraph" w:styleId="Heading1">
+  <w:style w:type="paragraph" w:styleId="Rubrik1">
     <w:name w:val="heading 1"/>
     <w:basedOn w:val="Normal"/>
     <w:next w:val="Normal"/>
-    <w:link w:val="Heading1Char"/>
+    <w:link w:val="Rubrik1Char"/>
     <w:uiPriority w:val="9"/>
     <w:qFormat/>
     <w:rsid w:val="0000471D"/>
@@ -4636,11 +4677,11 @@
       <w:szCs w:val="40"/>
     </w:rPr>
   </w:style>
-  <w:style w:type="paragraph" w:styleId="Heading2">
+  <w:style w:type="paragraph" w:styleId="Rubrik2">
     <w:name w:val="heading 2"/>
     <w:basedOn w:val="Normal"/>
     <w:next w:val="Normal"/>
-    <w:link w:val="Heading2Char"/>
+    <w:link w:val="Rubrik2Char"/>
     <w:uiPriority w:val="9"/>
     <w:unhideWhenUsed/>
     <w:qFormat/>
@@ -4658,11 +4699,11 @@
       <w:szCs w:val="32"/>
     </w:rPr>
   </w:style>
-  <w:style w:type="paragraph" w:styleId="Heading3">
+  <w:style w:type="paragraph" w:styleId="Rubrik3">
     <w:name w:val="heading 3"/>
     <w:basedOn w:val="Normal"/>
     <w:next w:val="Normal"/>
-    <w:link w:val="Heading3Char"/>
+    <w:link w:val="Rubrik3Char"/>
     <w:uiPriority w:val="9"/>
     <w:unhideWhenUsed/>
     <w:qFormat/>
@@ -4680,11 +4721,11 @@
       <w:szCs w:val="28"/>
     </w:rPr>
   </w:style>
-  <w:style w:type="paragraph" w:styleId="Heading4">
+  <w:style w:type="paragraph" w:styleId="Rubrik4">
     <w:name w:val="heading 4"/>
     <w:basedOn w:val="Normal"/>
     <w:next w:val="Normal"/>
-    <w:link w:val="Heading4Char"/>
+    <w:link w:val="Rubrik4Char"/>
     <w:uiPriority w:val="9"/>
     <w:semiHidden/>
     <w:unhideWhenUsed/>
@@ -4703,11 +4744,11 @@
       <w:color w:val="2F5496" w:themeColor="accent1" w:themeShade="BF"/>
     </w:rPr>
   </w:style>
-  <w:style w:type="paragraph" w:styleId="Heading5">
+  <w:style w:type="paragraph" w:styleId="Rubrik5">
     <w:name w:val="heading 5"/>
     <w:basedOn w:val="Normal"/>
     <w:next w:val="Normal"/>
-    <w:link w:val="Heading5Char"/>
+    <w:link w:val="Rubrik5Char"/>
     <w:uiPriority w:val="9"/>
     <w:semiHidden/>
     <w:unhideWhenUsed/>
@@ -4724,11 +4765,11 @@
       <w:color w:val="2F5496" w:themeColor="accent1" w:themeShade="BF"/>
     </w:rPr>
   </w:style>
-  <w:style w:type="paragraph" w:styleId="Heading6">
+  <w:style w:type="paragraph" w:styleId="Rubrik6">
     <w:name w:val="heading 6"/>
     <w:basedOn w:val="Normal"/>
     <w:next w:val="Normal"/>
-    <w:link w:val="Heading6Char"/>
+    <w:link w:val="Rubrik6Char"/>
     <w:uiPriority w:val="9"/>
     <w:semiHidden/>
     <w:unhideWhenUsed/>
@@ -4747,11 +4788,11 @@
       <w:color w:val="595959" w:themeColor="text1" w:themeTint="A6"/>
     </w:rPr>
   </w:style>
-  <w:style w:type="paragraph" w:styleId="Heading7">
+  <w:style w:type="paragraph" w:styleId="Rubrik7">
     <w:name w:val="heading 7"/>
     <w:basedOn w:val="Normal"/>
     <w:next w:val="Normal"/>
-    <w:link w:val="Heading7Char"/>
+    <w:link w:val="Rubrik7Char"/>
     <w:uiPriority w:val="9"/>
     <w:semiHidden/>
     <w:unhideWhenUsed/>
@@ -4768,11 +4809,11 @@
       <w:color w:val="595959" w:themeColor="text1" w:themeTint="A6"/>
     </w:rPr>
   </w:style>
-  <w:style w:type="paragraph" w:styleId="Heading8">
+  <w:style w:type="paragraph" w:styleId="Rubrik8">
     <w:name w:val="heading 8"/>
     <w:basedOn w:val="Normal"/>
     <w:next w:val="Normal"/>
-    <w:link w:val="Heading8Char"/>
+    <w:link w:val="Rubrik8Char"/>
     <w:uiPriority w:val="9"/>
     <w:semiHidden/>
     <w:unhideWhenUsed/>
@@ -4791,11 +4832,11 @@
       <w:color w:val="272727" w:themeColor="text1" w:themeTint="D8"/>
     </w:rPr>
   </w:style>
-  <w:style w:type="paragraph" w:styleId="Heading9">
+  <w:style w:type="paragraph" w:styleId="Rubrik9">
     <w:name w:val="heading 9"/>
     <w:basedOn w:val="Normal"/>
     <w:next w:val="Normal"/>
-    <w:link w:val="Heading9Char"/>
+    <w:link w:val="Rubrik9Char"/>
     <w:uiPriority w:val="9"/>
     <w:semiHidden/>
     <w:unhideWhenUsed/>
@@ -4812,12 +4853,13 @@
       <w:color w:val="272727" w:themeColor="text1" w:themeTint="D8"/>
     </w:rPr>
   </w:style>
-  <w:style w:type="character" w:default="1" w:styleId="DefaultParagraphFont">
+  <w:style w:type="character" w:default="1" w:styleId="Standardstycketeckensnitt">
     <w:name w:val="Default Paragraph Font"/>
     <w:uiPriority w:val="1"/>
+    <w:semiHidden/>
     <w:unhideWhenUsed/>
   </w:style>
-  <w:style w:type="table" w:default="1" w:styleId="TableNormal">
+  <w:style w:type="table" w:default="1" w:styleId="Normaltabell">
     <w:name w:val="Normal Table"/>
     <w:uiPriority w:val="99"/>
     <w:semiHidden/>
@@ -4832,16 +4874,16 @@
       </w:tblCellMar>
     </w:tblPr>
   </w:style>
-  <w:style w:type="numbering" w:default="1" w:styleId="NoList">
+  <w:style w:type="numbering" w:default="1" w:styleId="Ingenlista">
     <w:name w:val="No List"/>
     <w:uiPriority w:val="99"/>
     <w:semiHidden/>
     <w:unhideWhenUsed/>
   </w:style>
-  <w:style w:type="character" w:customStyle="1" w:styleId="Heading1Char">
-    <w:name w:val="Heading 1 Char"/>
-    <w:basedOn w:val="DefaultParagraphFont"/>
-    <w:link w:val="Heading1"/>
+  <w:style w:type="character" w:customStyle="1" w:styleId="Rubrik1Char">
+    <w:name w:val="Rubrik 1 Char"/>
+    <w:basedOn w:val="Standardstycketeckensnitt"/>
+    <w:link w:val="Rubrik1"/>
     <w:uiPriority w:val="9"/>
     <w:rsid w:val="0000471D"/>
     <w:rPr>
@@ -4851,10 +4893,10 @@
       <w:szCs w:val="40"/>
     </w:rPr>
   </w:style>
-  <w:style w:type="character" w:customStyle="1" w:styleId="Heading2Char">
-    <w:name w:val="Heading 2 Char"/>
-    <w:basedOn w:val="DefaultParagraphFont"/>
-    <w:link w:val="Heading2"/>
+  <w:style w:type="character" w:customStyle="1" w:styleId="Rubrik2Char">
+    <w:name w:val="Rubrik 2 Char"/>
+    <w:basedOn w:val="Standardstycketeckensnitt"/>
+    <w:link w:val="Rubrik2"/>
     <w:uiPriority w:val="9"/>
     <w:rsid w:val="0000471D"/>
     <w:rPr>
@@ -4864,10 +4906,10 @@
       <w:szCs w:val="32"/>
     </w:rPr>
   </w:style>
-  <w:style w:type="character" w:customStyle="1" w:styleId="Heading3Char">
-    <w:name w:val="Heading 3 Char"/>
-    <w:basedOn w:val="DefaultParagraphFont"/>
-    <w:link w:val="Heading3"/>
+  <w:style w:type="character" w:customStyle="1" w:styleId="Rubrik3Char">
+    <w:name w:val="Rubrik 3 Char"/>
+    <w:basedOn w:val="Standardstycketeckensnitt"/>
+    <w:link w:val="Rubrik3"/>
     <w:uiPriority w:val="9"/>
     <w:rsid w:val="0000471D"/>
     <w:rPr>
@@ -4877,10 +4919,10 @@
       <w:szCs w:val="28"/>
     </w:rPr>
   </w:style>
-  <w:style w:type="character" w:customStyle="1" w:styleId="Heading4Char">
-    <w:name w:val="Heading 4 Char"/>
-    <w:basedOn w:val="DefaultParagraphFont"/>
-    <w:link w:val="Heading4"/>
+  <w:style w:type="character" w:customStyle="1" w:styleId="Rubrik4Char">
+    <w:name w:val="Rubrik 4 Char"/>
+    <w:basedOn w:val="Standardstycketeckensnitt"/>
+    <w:link w:val="Rubrik4"/>
     <w:uiPriority w:val="9"/>
     <w:semiHidden/>
     <w:rsid w:val="0000471D"/>
@@ -4891,10 +4933,10 @@
       <w:color w:val="2F5496" w:themeColor="accent1" w:themeShade="BF"/>
     </w:rPr>
   </w:style>
-  <w:style w:type="character" w:customStyle="1" w:styleId="Heading5Char">
-    <w:name w:val="Heading 5 Char"/>
-    <w:basedOn w:val="DefaultParagraphFont"/>
-    <w:link w:val="Heading5"/>
+  <w:style w:type="character" w:customStyle="1" w:styleId="Rubrik5Char">
+    <w:name w:val="Rubrik 5 Char"/>
+    <w:basedOn w:val="Standardstycketeckensnitt"/>
+    <w:link w:val="Rubrik5"/>
     <w:uiPriority w:val="9"/>
     <w:semiHidden/>
     <w:rsid w:val="0000471D"/>
@@ -4903,10 +4945,10 @@
       <w:color w:val="2F5496" w:themeColor="accent1" w:themeShade="BF"/>
     </w:rPr>
   </w:style>
-  <w:style w:type="character" w:customStyle="1" w:styleId="Heading6Char">
-    <w:name w:val="Heading 6 Char"/>
-    <w:basedOn w:val="DefaultParagraphFont"/>
-    <w:link w:val="Heading6"/>
+  <w:style w:type="character" w:customStyle="1" w:styleId="Rubrik6Char">
+    <w:name w:val="Rubrik 6 Char"/>
+    <w:basedOn w:val="Standardstycketeckensnitt"/>
+    <w:link w:val="Rubrik6"/>
     <w:uiPriority w:val="9"/>
     <w:semiHidden/>
     <w:rsid w:val="0000471D"/>
@@ -4917,10 +4959,10 @@
       <w:color w:val="595959" w:themeColor="text1" w:themeTint="A6"/>
     </w:rPr>
   </w:style>
-  <w:style w:type="character" w:customStyle="1" w:styleId="Heading7Char">
-    <w:name w:val="Heading 7 Char"/>
-    <w:basedOn w:val="DefaultParagraphFont"/>
-    <w:link w:val="Heading7"/>
+  <w:style w:type="character" w:customStyle="1" w:styleId="Rubrik7Char">
+    <w:name w:val="Rubrik 7 Char"/>
+    <w:basedOn w:val="Standardstycketeckensnitt"/>
+    <w:link w:val="Rubrik7"/>
     <w:uiPriority w:val="9"/>
     <w:semiHidden/>
     <w:rsid w:val="0000471D"/>
@@ -4929,10 +4971,10 @@
       <w:color w:val="595959" w:themeColor="text1" w:themeTint="A6"/>
     </w:rPr>
   </w:style>
-  <w:style w:type="character" w:customStyle="1" w:styleId="Heading8Char">
-    <w:name w:val="Heading 8 Char"/>
-    <w:basedOn w:val="DefaultParagraphFont"/>
-    <w:link w:val="Heading8"/>
+  <w:style w:type="character" w:customStyle="1" w:styleId="Rubrik8Char">
+    <w:name w:val="Rubrik 8 Char"/>
+    <w:basedOn w:val="Standardstycketeckensnitt"/>
+    <w:link w:val="Rubrik8"/>
     <w:uiPriority w:val="9"/>
     <w:semiHidden/>
     <w:rsid w:val="0000471D"/>
@@ -4943,10 +4985,10 @@
       <w:color w:val="272727" w:themeColor="text1" w:themeTint="D8"/>
     </w:rPr>
   </w:style>
-  <w:style w:type="character" w:customStyle="1" w:styleId="Heading9Char">
-    <w:name w:val="Heading 9 Char"/>
-    <w:basedOn w:val="DefaultParagraphFont"/>
-    <w:link w:val="Heading9"/>
+  <w:style w:type="character" w:customStyle="1" w:styleId="Rubrik9Char">
+    <w:name w:val="Rubrik 9 Char"/>
+    <w:basedOn w:val="Standardstycketeckensnitt"/>
+    <w:link w:val="Rubrik9"/>
     <w:uiPriority w:val="9"/>
     <w:semiHidden/>
     <w:rsid w:val="0000471D"/>
@@ -4955,11 +4997,11 @@
       <w:color w:val="272727" w:themeColor="text1" w:themeTint="D8"/>
     </w:rPr>
   </w:style>
-  <w:style w:type="paragraph" w:styleId="Title">
+  <w:style w:type="paragraph" w:styleId="Rubrik">
     <w:name w:val="Title"/>
     <w:basedOn w:val="Normal"/>
     <w:next w:val="Normal"/>
-    <w:link w:val="TitleChar"/>
+    <w:link w:val="RubrikChar"/>
     <w:uiPriority w:val="10"/>
     <w:qFormat/>
     <w:rsid w:val="0000471D"/>
@@ -4975,10 +5017,10 @@
       <w:szCs w:val="56"/>
     </w:rPr>
   </w:style>
-  <w:style w:type="character" w:customStyle="1" w:styleId="TitleChar">
-    <w:name w:val="Title Char"/>
-    <w:basedOn w:val="DefaultParagraphFont"/>
-    <w:link w:val="Title"/>
+  <w:style w:type="character" w:customStyle="1" w:styleId="RubrikChar">
+    <w:name w:val="Rubrik Char"/>
+    <w:basedOn w:val="Standardstycketeckensnitt"/>
+    <w:link w:val="Rubrik"/>
     <w:uiPriority w:val="10"/>
     <w:rsid w:val="0000471D"/>
     <w:rPr>
@@ -4989,11 +5031,11 @@
       <w:szCs w:val="56"/>
     </w:rPr>
   </w:style>
-  <w:style w:type="paragraph" w:styleId="Subtitle">
+  <w:style w:type="paragraph" w:styleId="Underrubrik">
     <w:name w:val="Subtitle"/>
     <w:basedOn w:val="Normal"/>
     <w:next w:val="Normal"/>
-    <w:link w:val="SubtitleChar"/>
+    <w:link w:val="UnderrubrikChar"/>
     <w:uiPriority w:val="11"/>
     <w:qFormat/>
     <w:rsid w:val="0000471D"/>
@@ -5010,10 +5052,10 @@
       <w:szCs w:val="28"/>
     </w:rPr>
   </w:style>
-  <w:style w:type="character" w:customStyle="1" w:styleId="SubtitleChar">
-    <w:name w:val="Subtitle Char"/>
-    <w:basedOn w:val="DefaultParagraphFont"/>
-    <w:link w:val="Subtitle"/>
+  <w:style w:type="character" w:customStyle="1" w:styleId="UnderrubrikChar">
+    <w:name w:val="Underrubrik Char"/>
+    <w:basedOn w:val="Standardstycketeckensnitt"/>
+    <w:link w:val="Underrubrik"/>
     <w:uiPriority w:val="11"/>
     <w:rsid w:val="0000471D"/>
     <w:rPr>
@@ -5024,11 +5066,11 @@
       <w:szCs w:val="28"/>
     </w:rPr>
   </w:style>
-  <w:style w:type="paragraph" w:styleId="Quote">
+  <w:style w:type="paragraph" w:styleId="Citat">
     <w:name w:val="Quote"/>
     <w:basedOn w:val="Normal"/>
     <w:next w:val="Normal"/>
-    <w:link w:val="QuoteChar"/>
+    <w:link w:val="CitatChar"/>
     <w:uiPriority w:val="29"/>
     <w:qFormat/>
     <w:rsid w:val="0000471D"/>
@@ -5042,10 +5084,10 @@
       <w:color w:val="404040" w:themeColor="text1" w:themeTint="BF"/>
     </w:rPr>
   </w:style>
-  <w:style w:type="character" w:customStyle="1" w:styleId="QuoteChar">
-    <w:name w:val="Quote Char"/>
-    <w:basedOn w:val="DefaultParagraphFont"/>
-    <w:link w:val="Quote"/>
+  <w:style w:type="character" w:customStyle="1" w:styleId="CitatChar">
+    <w:name w:val="Citat Char"/>
+    <w:basedOn w:val="Standardstycketeckensnitt"/>
+    <w:link w:val="Citat"/>
     <w:uiPriority w:val="29"/>
     <w:rsid w:val="0000471D"/>
     <w:rPr>
@@ -5054,7 +5096,7 @@
       <w:color w:val="404040" w:themeColor="text1" w:themeTint="BF"/>
     </w:rPr>
   </w:style>
-  <w:style w:type="paragraph" w:styleId="ListParagraph">
+  <w:style w:type="paragraph" w:styleId="Liststycke">
     <w:name w:val="List Paragraph"/>
     <w:basedOn w:val="Normal"/>
     <w:uiPriority w:val="34"/>
@@ -5065,9 +5107,9 @@
       <w:contextualSpacing/>
     </w:pPr>
   </w:style>
-  <w:style w:type="character" w:styleId="IntenseEmphasis">
+  <w:style w:type="character" w:styleId="Starkbetoning">
     <w:name w:val="Intense Emphasis"/>
-    <w:basedOn w:val="DefaultParagraphFont"/>
+    <w:basedOn w:val="Standardstycketeckensnitt"/>
     <w:uiPriority w:val="21"/>
     <w:qFormat/>
     <w:rsid w:val="0000471D"/>
@@ -5077,11 +5119,11 @@
       <w:color w:val="2F5496" w:themeColor="accent1" w:themeShade="BF"/>
     </w:rPr>
   </w:style>
-  <w:style w:type="paragraph" w:styleId="IntenseQuote">
+  <w:style w:type="paragraph" w:styleId="Starktcitat">
     <w:name w:val="Intense Quote"/>
     <w:basedOn w:val="Normal"/>
     <w:next w:val="Normal"/>
-    <w:link w:val="IntenseQuoteChar"/>
+    <w:link w:val="StarktcitatChar"/>
     <w:uiPriority w:val="30"/>
     <w:qFormat/>
     <w:rsid w:val="0000471D"/>
@@ -5100,10 +5142,10 @@
       <w:color w:val="2F5496" w:themeColor="accent1" w:themeShade="BF"/>
     </w:rPr>
   </w:style>
-  <w:style w:type="character" w:customStyle="1" w:styleId="IntenseQuoteChar">
-    <w:name w:val="Intense Quote Char"/>
-    <w:basedOn w:val="DefaultParagraphFont"/>
-    <w:link w:val="IntenseQuote"/>
+  <w:style w:type="character" w:customStyle="1" w:styleId="StarktcitatChar">
+    <w:name w:val="Starkt citat Char"/>
+    <w:basedOn w:val="Standardstycketeckensnitt"/>
+    <w:link w:val="Starktcitat"/>
     <w:uiPriority w:val="30"/>
     <w:rsid w:val="0000471D"/>
     <w:rPr>
@@ -5112,9 +5154,9 @@
       <w:color w:val="2F5496" w:themeColor="accent1" w:themeShade="BF"/>
     </w:rPr>
   </w:style>
-  <w:style w:type="character" w:styleId="IntenseReference">
+  <w:style w:type="character" w:styleId="Starkreferens">
     <w:name w:val="Intense Reference"/>
-    <w:basedOn w:val="DefaultParagraphFont"/>
+    <w:basedOn w:val="Standardstycketeckensnitt"/>
     <w:uiPriority w:val="32"/>
     <w:qFormat/>
     <w:rsid w:val="0000471D"/>
@@ -5126,9 +5168,9 @@
       <w:spacing w:val="5"/>
     </w:rPr>
   </w:style>
-  <w:style w:type="character" w:styleId="Hyperlink">
+  <w:style w:type="character" w:styleId="Hyperlnk">
     <w:name w:val="Hyperlink"/>
-    <w:basedOn w:val="DefaultParagraphFont"/>
+    <w:basedOn w:val="Standardstycketeckensnitt"/>
     <w:uiPriority w:val="99"/>
     <w:unhideWhenUsed/>
     <w:rsid w:val="00974B24"/>
@@ -5137,9 +5179,9 @@
       <w:u w:val="single"/>
     </w:rPr>
   </w:style>
-  <w:style w:type="character" w:styleId="UnresolvedMention">
+  <w:style w:type="character" w:styleId="Olstomnmnande">
     <w:name w:val="Unresolved Mention"/>
-    <w:basedOn w:val="DefaultParagraphFont"/>
+    <w:basedOn w:val="Standardstycketeckensnitt"/>
     <w:uiPriority w:val="99"/>
     <w:semiHidden/>
     <w:unhideWhenUsed/>
@@ -5149,9 +5191,9 @@
       <w:shd w:val="clear" w:color="auto" w:fill="E1DFDD"/>
     </w:rPr>
   </w:style>
-  <w:style w:type="table" w:styleId="TableGrid">
+  <w:style w:type="table" w:styleId="Tabellrutnt">
     <w:name w:val="Table Grid"/>
-    <w:basedOn w:val="TableNormal"/>
+    <w:basedOn w:val="Normaltabell"/>
     <w:uiPriority w:val="39"/>
     <w:rsid w:val="00632EB9"/>
     <w:pPr>
@@ -5168,7 +5210,7 @@
       </w:tblBorders>
     </w:tblPr>
   </w:style>
-  <w:style w:type="paragraph" w:styleId="NormalWeb">
+  <w:style w:type="paragraph" w:styleId="Normalwebb">
     <w:name w:val="Normal (Web)"/>
     <w:basedOn w:val="Normal"/>
     <w:uiPriority w:val="99"/>
@@ -5186,10 +5228,10 @@
       <w14:ligatures w14:val="none"/>
     </w:rPr>
   </w:style>
-  <w:style w:type="paragraph" w:styleId="Header">
+  <w:style w:type="paragraph" w:styleId="Sidhuvud">
     <w:name w:val="header"/>
     <w:basedOn w:val="Normal"/>
-    <w:link w:val="HeaderChar"/>
+    <w:link w:val="SidhuvudChar"/>
     <w:uiPriority w:val="99"/>
     <w:unhideWhenUsed/>
     <w:rsid w:val="0087493C"/>
@@ -5201,17 +5243,17 @@
       <w:spacing w:after="0" w:line="240" w:lineRule="auto"/>
     </w:pPr>
   </w:style>
-  <w:style w:type="character" w:customStyle="1" w:styleId="HeaderChar">
-    <w:name w:val="Header Char"/>
-    <w:basedOn w:val="DefaultParagraphFont"/>
-    <w:link w:val="Header"/>
+  <w:style w:type="character" w:customStyle="1" w:styleId="SidhuvudChar">
+    <w:name w:val="Sidhuvud Char"/>
+    <w:basedOn w:val="Standardstycketeckensnitt"/>
+    <w:link w:val="Sidhuvud"/>
     <w:uiPriority w:val="99"/>
     <w:rsid w:val="0087493C"/>
   </w:style>
-  <w:style w:type="paragraph" w:styleId="Footer">
+  <w:style w:type="paragraph" w:styleId="Sidfot">
     <w:name w:val="footer"/>
     <w:basedOn w:val="Normal"/>
-    <w:link w:val="FooterChar"/>
+    <w:link w:val="SidfotChar"/>
     <w:uiPriority w:val="99"/>
     <w:unhideWhenUsed/>
     <w:rsid w:val="0087493C"/>
@@ -5223,10 +5265,10 @@
       <w:spacing w:after="0" w:line="240" w:lineRule="auto"/>
     </w:pPr>
   </w:style>
-  <w:style w:type="character" w:customStyle="1" w:styleId="FooterChar">
-    <w:name w:val="Footer Char"/>
-    <w:basedOn w:val="DefaultParagraphFont"/>
-    <w:link w:val="Footer"/>
+  <w:style w:type="character" w:customStyle="1" w:styleId="SidfotChar">
+    <w:name w:val="Sidfot Char"/>
+    <w:basedOn w:val="Standardstycketeckensnitt"/>
+    <w:link w:val="Sidfot"/>
     <w:uiPriority w:val="99"/>
     <w:rsid w:val="0087493C"/>
   </w:style>

</xml_diff>

<commit_message>
Added information about bombs
</commit_message>
<xml_diff>
--- a/Documentation/Requirements and Mission Definition.docx
+++ b/Documentation/Requirements and Mission Definition.docx
@@ -211,6 +211,12 @@
           <w:color w:val="000000" w:themeColor="text1"/>
         </w:rPr>
         <w:t>good infrastructure for detecting forest fires in remote locations would be needed.</w:t>
+      </w:r>
+      <w:r>
+        <w:rPr>
+          <w:color w:val="000000" w:themeColor="text1"/>
+        </w:rPr>
+        <w:t xml:space="preserve"> </w:t>
       </w:r>
     </w:p>
     <w:p>
@@ -3320,7 +3326,19 @@
           <w:rPr>
             <w:rStyle w:val="Hyperlnk"/>
           </w:rPr>
-          <w:t>https://www.perimeter-solutions.com/product/phos-chek-259-fx-2/</w:t>
+          <w:t>https://www.peri</w:t>
+        </w:r>
+        <w:r>
+          <w:rPr>
+            <w:rStyle w:val="Hyperlnk"/>
+          </w:rPr>
+          <w:t>m</w:t>
+        </w:r>
+        <w:r>
+          <w:rPr>
+            <w:rStyle w:val="Hyperlnk"/>
+          </w:rPr>
+          <w:t>eter-solutions.com/product/phos-chek-259-fx-2/</w:t>
         </w:r>
       </w:hyperlink>
       <w:r>
@@ -3374,7 +3392,19 @@
           <w:rPr>
             <w:rStyle w:val="Hyperlnk"/>
           </w:rPr>
-          <w:t>https://jinghongdrone.com/fire-extinguishing-bomb-deployment-device</w:t>
+          <w:t>https://jinghongdrone.c</w:t>
+        </w:r>
+        <w:r>
+          <w:rPr>
+            <w:rStyle w:val="Hyperlnk"/>
+          </w:rPr>
+          <w:t>o</w:t>
+        </w:r>
+        <w:r>
+          <w:rPr>
+            <w:rStyle w:val="Hyperlnk"/>
+          </w:rPr>
+          <w:t>m/fire-extinguishing-bomb-deployment-device</w:t>
         </w:r>
       </w:hyperlink>
       <w:r>
@@ -3415,49 +3445,527 @@
           <w:rPr>
             <w:rStyle w:val="Hyperlnk"/>
           </w:rPr>
-          <w:t>https://salgrom.fi/en/how-does-impulse-dry-powder-fire-suppression-work/</w:t>
+          <w:t>https://s</w:t>
+        </w:r>
+        <w:r>
+          <w:rPr>
+            <w:rStyle w:val="Hyperlnk"/>
+          </w:rPr>
+          <w:t>a</w:t>
+        </w:r>
+        <w:r>
+          <w:rPr>
+            <w:rStyle w:val="Hyperlnk"/>
+          </w:rPr>
+          <w:t>lgrom.fi/en/how-does-impulse-dry-powder-fire-suppression-work/</w:t>
         </w:r>
       </w:hyperlink>
       <w:r>
         <w:t xml:space="preserve"> </w:t>
       </w:r>
     </w:p>
+    <w:p>
+      <w:pPr>
+        <w:ind w:left="720"/>
+      </w:pPr>
+    </w:p>
     <w:p/>
+    <w:p>
+      <w:pPr>
+        <w:rPr>
+          <w:b/>
+          <w:bCs/>
+        </w:rPr>
+      </w:pPr>
+      <w:r>
+        <w:rPr>
+          <w:b/>
+          <w:bCs/>
+        </w:rPr>
+        <w:br w:type="page"/>
+      </w:r>
+    </w:p>
+    <w:p>
+      <w:pPr>
+        <w:rPr>
+          <w:b/>
+          <w:bCs/>
+        </w:rPr>
+      </w:pPr>
+      <w:r>
+        <w:rPr>
+          <w:b/>
+          <w:bCs/>
+        </w:rPr>
+        <w:lastRenderedPageBreak/>
+        <w:t>Fire-extinguishing bombs</w:t>
+      </w:r>
+      <w:r>
+        <w:rPr>
+          <w:b/>
+          <w:bCs/>
+        </w:rPr>
+        <w:t xml:space="preserve">, options </w:t>
+      </w:r>
+      <w:r>
+        <w:rPr>
+          <w:b/>
+          <w:bCs/>
+        </w:rPr>
+        <w:t>available on market</w:t>
+      </w:r>
+    </w:p>
+    <w:p>
+      <w:pPr>
+        <w:rPr>
+          <w:b/>
+          <w:bCs/>
+        </w:rPr>
+      </w:pPr>
+    </w:p>
+    <w:p>
+      <w:pPr>
+        <w:pStyle w:val="Liststycke"/>
+        <w:numPr>
+          <w:ilvl w:val="0"/>
+          <w:numId w:val="6"/>
+        </w:numPr>
+      </w:pPr>
+      <w:proofErr w:type="spellStart"/>
+      <w:r>
+        <w:t>ZSdrone</w:t>
+      </w:r>
+      <w:proofErr w:type="spellEnd"/>
+      <w:r>
+        <w:t xml:space="preserve"> </w:t>
+      </w:r>
+      <w:r>
+        <w:t>SLM-P-10</w:t>
+      </w:r>
+      <w:r>
+        <w:t xml:space="preserve"> and </w:t>
+      </w:r>
+      <w:r>
+        <w:t>SLM-P-</w:t>
+      </w:r>
+      <w:r>
+        <w:t>25</w:t>
+      </w:r>
+      <w:r>
+        <w:t xml:space="preserve"> Fire Extinguisher Bomb</w:t>
+      </w:r>
+      <w:r>
+        <w:rPr>
+          <w:noProof/>
+        </w:rPr>
+        <w:t xml:space="preserve"> </w:t>
+      </w:r>
+    </w:p>
+    <w:tbl>
+      <w:tblPr>
+        <w:tblStyle w:val="Tabellrutnt"/>
+        <w:tblW w:w="7960" w:type="dxa"/>
+        <w:tblInd w:w="720" w:type="dxa"/>
+        <w:tblBorders>
+          <w:top w:val="none" w:sz="0" w:space="0" w:color="auto"/>
+          <w:left w:val="none" w:sz="0" w:space="0" w:color="auto"/>
+          <w:bottom w:val="none" w:sz="0" w:space="0" w:color="auto"/>
+          <w:right w:val="none" w:sz="0" w:space="0" w:color="auto"/>
+          <w:insideH w:val="none" w:sz="0" w:space="0" w:color="auto"/>
+          <w:insideV w:val="none" w:sz="0" w:space="0" w:color="auto"/>
+        </w:tblBorders>
+        <w:tblLook w:val="04A0" w:firstRow="1" w:lastRow="0" w:firstColumn="1" w:lastColumn="0" w:noHBand="0" w:noVBand="1"/>
+      </w:tblPr>
+      <w:tblGrid>
+        <w:gridCol w:w="3968"/>
+        <w:gridCol w:w="3992"/>
+      </w:tblGrid>
+      <w:tr>
+        <w:trPr>
+          <w:trHeight w:val="1951"/>
+        </w:trPr>
+        <w:tc>
+          <w:tcPr>
+            <w:tcW w:w="3968" w:type="dxa"/>
+          </w:tcPr>
+          <w:p>
+            <w:r>
+              <w:rPr>
+                <w:noProof/>
+              </w:rPr>
+              <w:drawing>
+                <wp:inline distT="0" distB="0" distL="0" distR="0" wp14:anchorId="67C76835" wp14:editId="775A4ABB">
+                  <wp:extent cx="1851660" cy="2171700"/>
+                  <wp:effectExtent l="0" t="0" r="0" b="0"/>
+                  <wp:docPr id="589741540" name="Bildobjekt 1"/>
+                  <wp:cNvGraphicFramePr>
+                    <a:graphicFrameLocks xmlns:a="http://schemas.openxmlformats.org/drawingml/2006/main" noChangeAspect="1"/>
+                  </wp:cNvGraphicFramePr>
+                  <a:graphic xmlns:a="http://schemas.openxmlformats.org/drawingml/2006/main">
+                    <a:graphicData uri="http://schemas.openxmlformats.org/drawingml/2006/picture">
+                      <pic:pic xmlns:pic="http://schemas.openxmlformats.org/drawingml/2006/picture">
+                        <pic:nvPicPr>
+                          <pic:cNvPr id="589741540" name=""/>
+                          <pic:cNvPicPr/>
+                        </pic:nvPicPr>
+                        <pic:blipFill>
+                          <a:blip r:embed="rId14"/>
+                          <a:stretch>
+                            <a:fillRect/>
+                          </a:stretch>
+                        </pic:blipFill>
+                        <pic:spPr>
+                          <a:xfrm>
+                            <a:off x="0" y="0"/>
+                            <a:ext cx="1856131" cy="2176944"/>
+                          </a:xfrm>
+                          <a:prstGeom prst="rect">
+                            <a:avLst/>
+                          </a:prstGeom>
+                        </pic:spPr>
+                      </pic:pic>
+                    </a:graphicData>
+                  </a:graphic>
+                </wp:inline>
+              </w:drawing>
+            </w:r>
+          </w:p>
+          <w:p>
+            <w:pPr>
+              <w:rPr>
+                <w:noProof/>
+              </w:rPr>
+            </w:pPr>
+            <w:r>
+              <w:rPr>
+                <w:noProof/>
+              </w:rPr>
+              <w:t>fire extinguishing agent:6.5kg</w:t>
+            </w:r>
+          </w:p>
+        </w:tc>
+        <w:tc>
+          <w:tcPr>
+            <w:tcW w:w="3992" w:type="dxa"/>
+          </w:tcPr>
+          <w:p>
+            <w:pPr>
+              <w:rPr>
+                <w:noProof/>
+              </w:rPr>
+            </w:pPr>
+            <w:r>
+              <w:rPr>
+                <w:noProof/>
+              </w:rPr>
+              <w:drawing>
+                <wp:inline distT="0" distB="0" distL="0" distR="0" wp14:anchorId="25AD9AAD" wp14:editId="3D102C73">
+                  <wp:extent cx="1819275" cy="2198756"/>
+                  <wp:effectExtent l="0" t="0" r="0" b="0"/>
+                  <wp:docPr id="1833923292" name="Bildobjekt 1"/>
+                  <wp:cNvGraphicFramePr>
+                    <a:graphicFrameLocks xmlns:a="http://schemas.openxmlformats.org/drawingml/2006/main" noChangeAspect="1"/>
+                  </wp:cNvGraphicFramePr>
+                  <a:graphic xmlns:a="http://schemas.openxmlformats.org/drawingml/2006/main">
+                    <a:graphicData uri="http://schemas.openxmlformats.org/drawingml/2006/picture">
+                      <pic:pic xmlns:pic="http://schemas.openxmlformats.org/drawingml/2006/picture">
+                        <pic:nvPicPr>
+                          <pic:cNvPr id="1833923292" name=""/>
+                          <pic:cNvPicPr/>
+                        </pic:nvPicPr>
+                        <pic:blipFill>
+                          <a:blip r:embed="rId15"/>
+                          <a:stretch>
+                            <a:fillRect/>
+                          </a:stretch>
+                        </pic:blipFill>
+                        <pic:spPr>
+                          <a:xfrm>
+                            <a:off x="0" y="0"/>
+                            <a:ext cx="1841583" cy="2225717"/>
+                          </a:xfrm>
+                          <a:prstGeom prst="rect">
+                            <a:avLst/>
+                          </a:prstGeom>
+                        </pic:spPr>
+                      </pic:pic>
+                    </a:graphicData>
+                  </a:graphic>
+                </wp:inline>
+              </w:drawing>
+            </w:r>
+          </w:p>
+          <w:p>
+            <w:pPr>
+              <w:rPr>
+                <w:noProof/>
+              </w:rPr>
+            </w:pPr>
+            <w:r>
+              <w:rPr>
+                <w:noProof/>
+              </w:rPr>
+              <w:t>fire extinguishing agent:23kg</w:t>
+            </w:r>
+          </w:p>
+        </w:tc>
+      </w:tr>
+    </w:tbl>
+    <w:p>
+      <w:pPr>
+        <w:ind w:firstLine="720"/>
+      </w:pPr>
+    </w:p>
+    <w:p>
+      <w:pPr>
+        <w:ind w:firstLine="720"/>
+        <w:rPr>
+          <w:noProof/>
+        </w:rPr>
+      </w:pPr>
+      <w:r>
+        <w:t>L</w:t>
+      </w:r>
+      <w:r>
+        <w:t>ot more data available</w:t>
+      </w:r>
+      <w:r>
+        <w:t xml:space="preserve"> on website</w:t>
+      </w:r>
+    </w:p>
+    <w:p>
+      <w:pPr>
+        <w:ind w:firstLine="720"/>
+        <w:rPr>
+          <w:noProof/>
+        </w:rPr>
+      </w:pPr>
+      <w:hyperlink r:id="rId16" w:history="1">
+        <w:r>
+          <w:rPr>
+            <w:rStyle w:val="Hyperlnk"/>
+            <w:noProof/>
+          </w:rPr>
+          <w:t>https://www.zs-uav.com/products/50</w:t>
+        </w:r>
+      </w:hyperlink>
+    </w:p>
     <w:p/>
+    <w:p>
+      <w:pPr>
+        <w:pStyle w:val="Liststycke"/>
+        <w:numPr>
+          <w:ilvl w:val="0"/>
+          <w:numId w:val="6"/>
+        </w:numPr>
+      </w:pPr>
+      <w:r>
+        <w:t xml:space="preserve">MAVERICK </w:t>
+      </w:r>
+      <w:r>
+        <w:t xml:space="preserve">Blackout Aerial Fire Extinguishing Shell with Circuit Board </w:t>
+      </w:r>
+    </w:p>
+    <w:p>
+      <w:pPr>
+        <w:pStyle w:val="Liststycke"/>
+      </w:pPr>
+      <w:r>
+        <w:rPr>
+          <w:noProof/>
+        </w:rPr>
+        <w:drawing>
+          <wp:inline distT="0" distB="0" distL="0" distR="0" wp14:anchorId="427E5E47" wp14:editId="04F3AC7A">
+            <wp:extent cx="1295400" cy="2679738"/>
+            <wp:effectExtent l="0" t="0" r="0" b="6350"/>
+            <wp:docPr id="1048273545" name="Bildobjekt 1"/>
+            <wp:cNvGraphicFramePr>
+              <a:graphicFrameLocks xmlns:a="http://schemas.openxmlformats.org/drawingml/2006/main" noChangeAspect="1"/>
+            </wp:cNvGraphicFramePr>
+            <a:graphic xmlns:a="http://schemas.openxmlformats.org/drawingml/2006/main">
+              <a:graphicData uri="http://schemas.openxmlformats.org/drawingml/2006/picture">
+                <pic:pic xmlns:pic="http://schemas.openxmlformats.org/drawingml/2006/picture">
+                  <pic:nvPicPr>
+                    <pic:cNvPr id="1048273545" name=""/>
+                    <pic:cNvPicPr/>
+                  </pic:nvPicPr>
+                  <pic:blipFill>
+                    <a:blip r:embed="rId17"/>
+                    <a:stretch>
+                      <a:fillRect/>
+                    </a:stretch>
+                  </pic:blipFill>
+                  <pic:spPr>
+                    <a:xfrm>
+                      <a:off x="0" y="0"/>
+                      <a:ext cx="1296979" cy="2683005"/>
+                    </a:xfrm>
+                    <a:prstGeom prst="rect">
+                      <a:avLst/>
+                    </a:prstGeom>
+                  </pic:spPr>
+                </pic:pic>
+              </a:graphicData>
+            </a:graphic>
+          </wp:inline>
+        </w:drawing>
+      </w:r>
+    </w:p>
+    <w:p>
+      <w:pPr>
+        <w:pStyle w:val="Liststycke"/>
+      </w:pPr>
+      <w:r>
+        <w:t>6, 10, 25 and 50 L of powder volume (little data available, sems to be impact activated)</w:t>
+      </w:r>
+    </w:p>
+    <w:p>
+      <w:pPr>
+        <w:pStyle w:val="Liststycke"/>
+      </w:pPr>
+      <w:hyperlink r:id="rId18" w:history="1">
+        <w:r>
+          <w:rPr>
+            <w:rStyle w:val="Hyperlnk"/>
+          </w:rPr>
+          <w:t>https://www.maverickdrone.com/collections/blackout/products/fire-extinguishing-bomb-shell-and-circuit-board</w:t>
+        </w:r>
+      </w:hyperlink>
+    </w:p>
+    <w:p>
+      <w:pPr>
+        <w:pStyle w:val="Liststycke"/>
+      </w:pPr>
+    </w:p>
+    <w:p>
+      <w:pPr>
+        <w:pStyle w:val="Liststycke"/>
+        <w:numPr>
+          <w:ilvl w:val="0"/>
+          <w:numId w:val="6"/>
+        </w:numPr>
+      </w:pPr>
+      <w:proofErr w:type="spellStart"/>
+      <w:r>
+        <w:lastRenderedPageBreak/>
+        <w:t>JingHong</w:t>
+      </w:r>
+      <w:proofErr w:type="spellEnd"/>
+      <w:r>
+        <w:t xml:space="preserve"> Water-Based Fire-Extinguishing Bomb</w:t>
+      </w:r>
+      <w:r>
+        <w:rPr>
+          <w:noProof/>
+        </w:rPr>
+        <w:drawing>
+          <wp:inline distT="0" distB="0" distL="0" distR="0" wp14:anchorId="25FDB788" wp14:editId="117693A2">
+            <wp:extent cx="3257550" cy="1531049"/>
+            <wp:effectExtent l="0" t="0" r="0" b="0"/>
+            <wp:docPr id="1760069425" name="Bildobjekt 1"/>
+            <wp:cNvGraphicFramePr>
+              <a:graphicFrameLocks xmlns:a="http://schemas.openxmlformats.org/drawingml/2006/main" noChangeAspect="1"/>
+            </wp:cNvGraphicFramePr>
+            <a:graphic xmlns:a="http://schemas.openxmlformats.org/drawingml/2006/main">
+              <a:graphicData uri="http://schemas.openxmlformats.org/drawingml/2006/picture">
+                <pic:pic xmlns:pic="http://schemas.openxmlformats.org/drawingml/2006/picture">
+                  <pic:nvPicPr>
+                    <pic:cNvPr id="1760069425" name=""/>
+                    <pic:cNvPicPr/>
+                  </pic:nvPicPr>
+                  <pic:blipFill>
+                    <a:blip r:embed="rId19"/>
+                    <a:stretch>
+                      <a:fillRect/>
+                    </a:stretch>
+                  </pic:blipFill>
+                  <pic:spPr>
+                    <a:xfrm>
+                      <a:off x="0" y="0"/>
+                      <a:ext cx="3265867" cy="1534958"/>
+                    </a:xfrm>
+                    <a:prstGeom prst="rect">
+                      <a:avLst/>
+                    </a:prstGeom>
+                  </pic:spPr>
+                </pic:pic>
+              </a:graphicData>
+            </a:graphic>
+          </wp:inline>
+        </w:drawing>
+      </w:r>
+    </w:p>
+    <w:p>
+      <w:pPr>
+        <w:pStyle w:val="Liststycke"/>
+      </w:pPr>
+      <w:r>
+        <w:t>25 L of powder volume (lot more data available)</w:t>
+      </w:r>
+    </w:p>
+    <w:p>
+      <w:pPr>
+        <w:pStyle w:val="Liststycke"/>
+      </w:pPr>
+      <w:hyperlink r:id="rId20" w:history="1">
+        <w:r>
+          <w:rPr>
+            <w:rStyle w:val="Hyperlnk"/>
+          </w:rPr>
+          <w:t>https://jinghongdrone.com/jinghong-water-based-fire-exting</w:t>
+        </w:r>
+        <w:r>
+          <w:rPr>
+            <w:rStyle w:val="Hyperlnk"/>
+          </w:rPr>
+          <w:t>u</w:t>
+        </w:r>
+        <w:r>
+          <w:rPr>
+            <w:rStyle w:val="Hyperlnk"/>
+          </w:rPr>
+          <w:t>ishing-bomb</w:t>
+        </w:r>
+      </w:hyperlink>
+    </w:p>
+    <w:p>
+      <w:pPr>
+        <w:pStyle w:val="Liststycke"/>
+      </w:pPr>
+    </w:p>
+    <w:p>
+      <w:pPr>
+        <w:ind w:left="360"/>
+      </w:pPr>
+    </w:p>
+    <w:p>
+      <w:pPr>
+        <w:rPr>
+          <w:rFonts w:eastAsiaTheme="majorEastAsia" w:cstheme="majorBidi"/>
+          <w:color w:val="2F5496" w:themeColor="accent1" w:themeShade="BF"/>
+          <w:sz w:val="28"/>
+          <w:szCs w:val="28"/>
+        </w:rPr>
+      </w:pPr>
+      <w:r>
+        <w:br w:type="page"/>
+      </w:r>
+    </w:p>
+    <w:p>
+      <w:pPr>
+        <w:pStyle w:val="Rubrik3"/>
+      </w:pPr>
+      <w:r>
+        <w:lastRenderedPageBreak/>
+        <w:t>References</w:t>
+      </w:r>
+    </w:p>
     <w:p/>
-    <w:p/>
-    <w:p/>
-    <w:p/>
-    <w:p/>
-    <w:p/>
-    <w:p/>
-    <w:p/>
-    <w:p/>
-    <w:p/>
-    <w:p/>
-    <w:p/>
-    <w:p/>
-    <w:p/>
-    <w:p/>
-    <w:p/>
-    <w:p/>
-    <w:p/>
-    <w:p/>
-    <w:p/>
-    <w:p>
-      <w:pPr>
-        <w:pStyle w:val="Rubrik3"/>
-      </w:pPr>
-      <w:r>
-        <w:t>References</w:t>
-      </w:r>
-    </w:p>
-    <w:p/>
     <w:p>
       <w:r>
         <w:t xml:space="preserve">[1] </w:t>
       </w:r>
-      <w:hyperlink r:id="rId14" w:history="1">
+      <w:hyperlink r:id="rId21" w:history="1">
         <w:r>
           <w:rPr>
             <w:rStyle w:val="Hyperlnk"/>
@@ -3473,7 +3981,7 @@
       <w:r>
         <w:t xml:space="preserve">[2] </w:t>
       </w:r>
-      <w:hyperlink r:id="rId15" w:history="1">
+      <w:hyperlink r:id="rId22" w:history="1">
         <w:r>
           <w:rPr>
             <w:rStyle w:val="Hyperlnk"/>
@@ -3495,7 +4003,7 @@
       <w:r>
         <w:t xml:space="preserve">] </w:t>
       </w:r>
-      <w:hyperlink r:id="rId16" w:history="1">
+      <w:hyperlink r:id="rId23" w:history="1">
         <w:r>
           <w:rPr>
             <w:rStyle w:val="Hyperlnk"/>
@@ -3519,7 +4027,7 @@
       </w:r>
     </w:p>
     <w:p>
-      <w:hyperlink r:id="rId17" w:history="1">
+      <w:hyperlink r:id="rId24" w:history="1">
         <w:r>
           <w:rPr>
             <w:rStyle w:val="Hyperlnk"/>
@@ -3543,7 +4051,7 @@
       </w:r>
     </w:p>
     <w:p>
-      <w:hyperlink r:id="rId18" w:history="1">
+      <w:hyperlink r:id="rId25" w:history="1">
         <w:r>
           <w:rPr>
             <w:rStyle w:val="Hyperlnk"/>
@@ -3567,7 +4075,7 @@
       </w:r>
     </w:p>
     <w:p>
-      <w:hyperlink r:id="rId19" w:history="1">
+      <w:hyperlink r:id="rId26" w:history="1">
         <w:r>
           <w:rPr>
             <w:rStyle w:val="Hyperlnk"/>
@@ -3578,7 +4086,6 @@
     </w:p>
     <w:p>
       <w:r>
-        <w:lastRenderedPageBreak/>
         <w:t>[</w:t>
       </w:r>
       <w:r>
@@ -3589,7 +4096,7 @@
       </w:r>
     </w:p>
     <w:p>
-      <w:hyperlink r:id="rId20" w:history="1">
+      <w:hyperlink r:id="rId27" w:history="1">
         <w:r>
           <w:rPr>
             <w:rStyle w:val="Hyperlnk"/>
@@ -3603,8 +4110,8 @@
     </w:p>
     <w:p/>
     <w:sectPr>
-      <w:headerReference w:type="default" r:id="rId21"/>
-      <w:footerReference w:type="default" r:id="rId22"/>
+      <w:headerReference w:type="default" r:id="rId28"/>
+      <w:footerReference w:type="default" r:id="rId29"/>
       <w:pgSz w:w="11906" w:h="16838"/>
       <w:pgMar w:top="1440" w:right="1440" w:bottom="1440" w:left="1440" w:header="708" w:footer="708" w:gutter="0"/>
       <w:cols w:space="708"/>
@@ -3866,6 +4373,184 @@
     </w:lvl>
   </w:abstractNum>
   <w:abstractNum w:abstractNumId="1" w15:restartNumberingAfterBreak="0">
+    <w:nsid w:val="3939731D"/>
+    <w:multiLevelType w:val="hybridMultilevel"/>
+    <w:tmpl w:val="06E01574"/>
+    <w:lvl w:ilvl="0" w:tplc="041D000F">
+      <w:start w:val="1"/>
+      <w:numFmt w:val="decimal"/>
+      <w:lvlText w:val="%1."/>
+      <w:lvlJc w:val="left"/>
+      <w:pPr>
+        <w:ind w:left="720" w:hanging="360"/>
+      </w:pPr>
+      <w:rPr>
+        <w:rFonts w:hint="default"/>
+      </w:rPr>
+    </w:lvl>
+    <w:lvl w:ilvl="1" w:tplc="041D0019" w:tentative="1">
+      <w:start w:val="1"/>
+      <w:numFmt w:val="lowerLetter"/>
+      <w:lvlText w:val="%2."/>
+      <w:lvlJc w:val="left"/>
+      <w:pPr>
+        <w:ind w:left="1440" w:hanging="360"/>
+      </w:pPr>
+    </w:lvl>
+    <w:lvl w:ilvl="2" w:tplc="041D001B" w:tentative="1">
+      <w:start w:val="1"/>
+      <w:numFmt w:val="lowerRoman"/>
+      <w:lvlText w:val="%3."/>
+      <w:lvlJc w:val="right"/>
+      <w:pPr>
+        <w:ind w:left="2160" w:hanging="180"/>
+      </w:pPr>
+    </w:lvl>
+    <w:lvl w:ilvl="3" w:tplc="041D000F" w:tentative="1">
+      <w:start w:val="1"/>
+      <w:numFmt w:val="decimal"/>
+      <w:lvlText w:val="%4."/>
+      <w:lvlJc w:val="left"/>
+      <w:pPr>
+        <w:ind w:left="2880" w:hanging="360"/>
+      </w:pPr>
+    </w:lvl>
+    <w:lvl w:ilvl="4" w:tplc="041D0019" w:tentative="1">
+      <w:start w:val="1"/>
+      <w:numFmt w:val="lowerLetter"/>
+      <w:lvlText w:val="%5."/>
+      <w:lvlJc w:val="left"/>
+      <w:pPr>
+        <w:ind w:left="3600" w:hanging="360"/>
+      </w:pPr>
+    </w:lvl>
+    <w:lvl w:ilvl="5" w:tplc="041D001B" w:tentative="1">
+      <w:start w:val="1"/>
+      <w:numFmt w:val="lowerRoman"/>
+      <w:lvlText w:val="%6."/>
+      <w:lvlJc w:val="right"/>
+      <w:pPr>
+        <w:ind w:left="4320" w:hanging="180"/>
+      </w:pPr>
+    </w:lvl>
+    <w:lvl w:ilvl="6" w:tplc="041D000F" w:tentative="1">
+      <w:start w:val="1"/>
+      <w:numFmt w:val="decimal"/>
+      <w:lvlText w:val="%7."/>
+      <w:lvlJc w:val="left"/>
+      <w:pPr>
+        <w:ind w:left="5040" w:hanging="360"/>
+      </w:pPr>
+    </w:lvl>
+    <w:lvl w:ilvl="7" w:tplc="041D0019" w:tentative="1">
+      <w:start w:val="1"/>
+      <w:numFmt w:val="lowerLetter"/>
+      <w:lvlText w:val="%8."/>
+      <w:lvlJc w:val="left"/>
+      <w:pPr>
+        <w:ind w:left="5760" w:hanging="360"/>
+      </w:pPr>
+    </w:lvl>
+    <w:lvl w:ilvl="8" w:tplc="041D001B" w:tentative="1">
+      <w:start w:val="1"/>
+      <w:numFmt w:val="lowerRoman"/>
+      <w:lvlText w:val="%9."/>
+      <w:lvlJc w:val="right"/>
+      <w:pPr>
+        <w:ind w:left="6480" w:hanging="180"/>
+      </w:pPr>
+    </w:lvl>
+  </w:abstractNum>
+  <w:abstractNum w:abstractNumId="2" w15:restartNumberingAfterBreak="0">
+    <w:nsid w:val="48D96CA5"/>
+    <w:multiLevelType w:val="hybridMultilevel"/>
+    <w:tmpl w:val="706ECC32"/>
+    <w:lvl w:ilvl="0" w:tplc="041D000F">
+      <w:start w:val="1"/>
+      <w:numFmt w:val="decimal"/>
+      <w:lvlText w:val="%1."/>
+      <w:lvlJc w:val="left"/>
+      <w:pPr>
+        <w:ind w:left="720" w:hanging="360"/>
+      </w:pPr>
+      <w:rPr>
+        <w:rFonts w:hint="default"/>
+      </w:rPr>
+    </w:lvl>
+    <w:lvl w:ilvl="1" w:tplc="041D0019" w:tentative="1">
+      <w:start w:val="1"/>
+      <w:numFmt w:val="lowerLetter"/>
+      <w:lvlText w:val="%2."/>
+      <w:lvlJc w:val="left"/>
+      <w:pPr>
+        <w:ind w:left="1440" w:hanging="360"/>
+      </w:pPr>
+    </w:lvl>
+    <w:lvl w:ilvl="2" w:tplc="041D001B" w:tentative="1">
+      <w:start w:val="1"/>
+      <w:numFmt w:val="lowerRoman"/>
+      <w:lvlText w:val="%3."/>
+      <w:lvlJc w:val="right"/>
+      <w:pPr>
+        <w:ind w:left="2160" w:hanging="180"/>
+      </w:pPr>
+    </w:lvl>
+    <w:lvl w:ilvl="3" w:tplc="041D000F" w:tentative="1">
+      <w:start w:val="1"/>
+      <w:numFmt w:val="decimal"/>
+      <w:lvlText w:val="%4."/>
+      <w:lvlJc w:val="left"/>
+      <w:pPr>
+        <w:ind w:left="2880" w:hanging="360"/>
+      </w:pPr>
+    </w:lvl>
+    <w:lvl w:ilvl="4" w:tplc="041D0019" w:tentative="1">
+      <w:start w:val="1"/>
+      <w:numFmt w:val="lowerLetter"/>
+      <w:lvlText w:val="%5."/>
+      <w:lvlJc w:val="left"/>
+      <w:pPr>
+        <w:ind w:left="3600" w:hanging="360"/>
+      </w:pPr>
+    </w:lvl>
+    <w:lvl w:ilvl="5" w:tplc="041D001B" w:tentative="1">
+      <w:start w:val="1"/>
+      <w:numFmt w:val="lowerRoman"/>
+      <w:lvlText w:val="%6."/>
+      <w:lvlJc w:val="right"/>
+      <w:pPr>
+        <w:ind w:left="4320" w:hanging="180"/>
+      </w:pPr>
+    </w:lvl>
+    <w:lvl w:ilvl="6" w:tplc="041D000F" w:tentative="1">
+      <w:start w:val="1"/>
+      <w:numFmt w:val="decimal"/>
+      <w:lvlText w:val="%7."/>
+      <w:lvlJc w:val="left"/>
+      <w:pPr>
+        <w:ind w:left="5040" w:hanging="360"/>
+      </w:pPr>
+    </w:lvl>
+    <w:lvl w:ilvl="7" w:tplc="041D0019" w:tentative="1">
+      <w:start w:val="1"/>
+      <w:numFmt w:val="lowerLetter"/>
+      <w:lvlText w:val="%8."/>
+      <w:lvlJc w:val="left"/>
+      <w:pPr>
+        <w:ind w:left="5760" w:hanging="360"/>
+      </w:pPr>
+    </w:lvl>
+    <w:lvl w:ilvl="8" w:tplc="041D001B" w:tentative="1">
+      <w:start w:val="1"/>
+      <w:numFmt w:val="lowerRoman"/>
+      <w:lvlText w:val="%9."/>
+      <w:lvlJc w:val="right"/>
+      <w:pPr>
+        <w:ind w:left="6480" w:hanging="180"/>
+      </w:pPr>
+    </w:lvl>
+  </w:abstractNum>
+  <w:abstractNum w:abstractNumId="3" w15:restartNumberingAfterBreak="0">
     <w:nsid w:val="5D7B12CB"/>
     <w:multiLevelType w:val="hybridMultilevel"/>
     <w:tmpl w:val="A142D454"/>
@@ -3978,7 +4663,7 @@
       </w:rPr>
     </w:lvl>
   </w:abstractNum>
-  <w:abstractNum w:abstractNumId="2" w15:restartNumberingAfterBreak="0">
+  <w:abstractNum w:abstractNumId="4" w15:restartNumberingAfterBreak="0">
     <w:nsid w:val="63644394"/>
     <w:multiLevelType w:val="hybridMultilevel"/>
     <w:tmpl w:val="87F2C098"/>
@@ -4091,7 +4776,7 @@
       </w:rPr>
     </w:lvl>
   </w:abstractNum>
-  <w:abstractNum w:abstractNumId="3" w15:restartNumberingAfterBreak="0">
+  <w:abstractNum w:abstractNumId="5" w15:restartNumberingAfterBreak="0">
     <w:nsid w:val="749F3E11"/>
     <w:multiLevelType w:val="multilevel"/>
     <w:tmpl w:val="8C52BF3E"/>
@@ -4244,13 +4929,19 @@
     <w:abstractNumId w:val="0"/>
   </w:num>
   <w:num w:numId="2" w16cid:durableId="244343648">
-    <w:abstractNumId w:val="1"/>
+    <w:abstractNumId w:val="3"/>
   </w:num>
   <w:num w:numId="3" w16cid:durableId="954872726">
+    <w:abstractNumId w:val="4"/>
+  </w:num>
+  <w:num w:numId="4" w16cid:durableId="791442887">
+    <w:abstractNumId w:val="5"/>
+  </w:num>
+  <w:num w:numId="5" w16cid:durableId="1266966228">
     <w:abstractNumId w:val="2"/>
   </w:num>
-  <w:num w:numId="4" w16cid:durableId="791442887">
-    <w:abstractNumId w:val="3"/>
+  <w:num w:numId="6" w16cid:durableId="1473132964">
+    <w:abstractNumId w:val="1"/>
   </w:num>
 </w:numbering>
 </file>
@@ -4856,7 +5547,6 @@
   <w:style w:type="character" w:default="1" w:styleId="Standardstycketeckensnitt">
     <w:name w:val="Default Paragraph Font"/>
     <w:uiPriority w:val="1"/>
-    <w:semiHidden/>
     <w:unhideWhenUsed/>
   </w:style>
   <w:style w:type="table" w:default="1" w:styleId="Normaltabell">
@@ -5272,6 +5962,18 @@
     <w:uiPriority w:val="99"/>
     <w:rsid w:val="0087493C"/>
   </w:style>
+  <w:style w:type="character" w:styleId="AnvndHyperlnk">
+    <w:name w:val="FollowedHyperlink"/>
+    <w:basedOn w:val="Standardstycketeckensnitt"/>
+    <w:uiPriority w:val="99"/>
+    <w:semiHidden/>
+    <w:unhideWhenUsed/>
+    <w:rsid w:val="00D84C99"/>
+    <w:rPr>
+      <w:color w:val="954F72" w:themeColor="followedHyperlink"/>
+      <w:u w:val="single"/>
+    </w:rPr>
+  </w:style>
 </w:styles>
 </file>
 

</xml_diff>

<commit_message>
link to 6.5kg bomb added
</commit_message>
<xml_diff>
--- a/Documentation/Requirements and Mission Definition.docx
+++ b/Documentation/Requirements and Mission Definition.docx
@@ -3326,19 +3326,7 @@
           <w:rPr>
             <w:rStyle w:val="Hyperlnk"/>
           </w:rPr>
-          <w:t>https://www.peri</w:t>
-        </w:r>
-        <w:r>
-          <w:rPr>
-            <w:rStyle w:val="Hyperlnk"/>
-          </w:rPr>
-          <w:t>m</w:t>
-        </w:r>
-        <w:r>
-          <w:rPr>
-            <w:rStyle w:val="Hyperlnk"/>
-          </w:rPr>
-          <w:t>eter-solutions.com/product/phos-chek-259-fx-2/</w:t>
+          <w:t>https://www.perimeter-solutions.com/product/phos-chek-259-fx-2/</w:t>
         </w:r>
       </w:hyperlink>
       <w:r>
@@ -3392,19 +3380,7 @@
           <w:rPr>
             <w:rStyle w:val="Hyperlnk"/>
           </w:rPr>
-          <w:t>https://jinghongdrone.c</w:t>
-        </w:r>
-        <w:r>
-          <w:rPr>
-            <w:rStyle w:val="Hyperlnk"/>
-          </w:rPr>
-          <w:t>o</w:t>
-        </w:r>
-        <w:r>
-          <w:rPr>
-            <w:rStyle w:val="Hyperlnk"/>
-          </w:rPr>
-          <w:t>m/fire-extinguishing-bomb-deployment-device</w:t>
+          <w:t>https://jinghongdrone.com/fire-extinguishing-bomb-deployment-device</w:t>
         </w:r>
       </w:hyperlink>
       <w:r>
@@ -3445,19 +3421,7 @@
           <w:rPr>
             <w:rStyle w:val="Hyperlnk"/>
           </w:rPr>
-          <w:t>https://s</w:t>
-        </w:r>
-        <w:r>
-          <w:rPr>
-            <w:rStyle w:val="Hyperlnk"/>
-          </w:rPr>
-          <w:t>a</w:t>
-        </w:r>
-        <w:r>
-          <w:rPr>
-            <w:rStyle w:val="Hyperlnk"/>
-          </w:rPr>
-          <w:t>lgrom.fi/en/how-does-impulse-dry-powder-fire-suppression-work/</w:t>
+          <w:t>https://salgrom.fi/en/how-does-impulse-dry-powder-fire-suppression-work/</w:t>
         </w:r>
       </w:hyperlink>
       <w:r>
@@ -3537,22 +3501,13 @@
       </w:r>
       <w:proofErr w:type="spellEnd"/>
       <w:r>
-        <w:t xml:space="preserve"> </w:t>
-      </w:r>
-      <w:r>
-        <w:t>SLM-P-10</w:t>
+        <w:t xml:space="preserve"> SLM-P-10</w:t>
       </w:r>
       <w:r>
         <w:t xml:space="preserve"> and </w:t>
       </w:r>
       <w:r>
-        <w:t>SLM-P-</w:t>
-      </w:r>
-      <w:r>
-        <w:t>25</w:t>
-      </w:r>
-      <w:r>
-        <w:t xml:space="preserve"> Fire Extinguisher Bomb</w:t>
+        <w:t>SLM-P-25 Fire Extinguisher Bomb</w:t>
       </w:r>
       <w:r>
         <w:rPr>
@@ -3724,13 +3679,7 @@
         </w:rPr>
       </w:pPr>
       <w:r>
-        <w:t>L</w:t>
-      </w:r>
-      <w:r>
-        <w:t>ot more data available</w:t>
-      </w:r>
-      <w:r>
-        <w:t xml:space="preserve"> on website</w:t>
+        <w:t>Lot more data available on website</w:t>
       </w:r>
     </w:p>
     <w:p>
@@ -3740,7 +3689,30 @@
           <w:noProof/>
         </w:rPr>
       </w:pPr>
+      <w:r>
+        <w:rPr>
+          <w:noProof/>
+        </w:rPr>
+        <w:t xml:space="preserve">6.5 kg: </w:t>
+      </w:r>
       <w:hyperlink r:id="rId16" w:history="1">
+        <w:r>
+          <w:rPr>
+            <w:rStyle w:val="Hyperlnk"/>
+            <w:noProof/>
+          </w:rPr>
+          <w:t>https://www.zs-uav.com/products/51</w:t>
+        </w:r>
+      </w:hyperlink>
+    </w:p>
+    <w:p>
+      <w:pPr>
+        <w:ind w:firstLine="720"/>
+      </w:pPr>
+      <w:r>
+        <w:t xml:space="preserve">23kg: </w:t>
+      </w:r>
+      <w:hyperlink r:id="rId17" w:history="1">
         <w:r>
           <w:rPr>
             <w:rStyle w:val="Hyperlnk"/>
@@ -3760,10 +3732,7 @@
         </w:numPr>
       </w:pPr>
       <w:r>
-        <w:t xml:space="preserve">MAVERICK </w:t>
-      </w:r>
-      <w:r>
-        <w:t xml:space="preserve">Blackout Aerial Fire Extinguishing Shell with Circuit Board </w:t>
+        <w:t xml:space="preserve">MAVERICK Blackout Aerial Fire Extinguishing Shell with Circuit Board </w:t>
       </w:r>
     </w:p>
     <w:p>
@@ -3790,7 +3759,7 @@
                     <pic:cNvPicPr/>
                   </pic:nvPicPr>
                   <pic:blipFill>
-                    <a:blip r:embed="rId17"/>
+                    <a:blip r:embed="rId18"/>
                     <a:stretch>
                       <a:fillRect/>
                     </a:stretch>
@@ -3823,7 +3792,7 @@
       <w:pPr>
         <w:pStyle w:val="Liststycke"/>
       </w:pPr>
-      <w:hyperlink r:id="rId18" w:history="1">
+      <w:hyperlink r:id="rId19" w:history="1">
         <w:r>
           <w:rPr>
             <w:rStyle w:val="Hyperlnk"/>
@@ -3874,7 +3843,7 @@
                     <pic:cNvPicPr/>
                   </pic:nvPicPr>
                   <pic:blipFill>
-                    <a:blip r:embed="rId19"/>
+                    <a:blip r:embed="rId20"/>
                     <a:stretch>
                       <a:fillRect/>
                     </a:stretch>
@@ -3907,24 +3876,12 @@
       <w:pPr>
         <w:pStyle w:val="Liststycke"/>
       </w:pPr>
-      <w:hyperlink r:id="rId20" w:history="1">
+      <w:hyperlink r:id="rId21" w:history="1">
         <w:r>
           <w:rPr>
             <w:rStyle w:val="Hyperlnk"/>
           </w:rPr>
-          <w:t>https://jinghongdrone.com/jinghong-water-based-fire-exting</w:t>
-        </w:r>
-        <w:r>
-          <w:rPr>
-            <w:rStyle w:val="Hyperlnk"/>
-          </w:rPr>
-          <w:t>u</w:t>
-        </w:r>
-        <w:r>
-          <w:rPr>
-            <w:rStyle w:val="Hyperlnk"/>
-          </w:rPr>
-          <w:t>ishing-bomb</w:t>
+          <w:t>https://jinghongdrone.com/jinghong-water-based-fire-extinguishing-bomb</w:t>
         </w:r>
       </w:hyperlink>
     </w:p>
@@ -3965,7 +3922,7 @@
       <w:r>
         <w:t xml:space="preserve">[1] </w:t>
       </w:r>
-      <w:hyperlink r:id="rId21" w:history="1">
+      <w:hyperlink r:id="rId22" w:history="1">
         <w:r>
           <w:rPr>
             <w:rStyle w:val="Hyperlnk"/>
@@ -3981,7 +3938,7 @@
       <w:r>
         <w:t xml:space="preserve">[2] </w:t>
       </w:r>
-      <w:hyperlink r:id="rId22" w:history="1">
+      <w:hyperlink r:id="rId23" w:history="1">
         <w:r>
           <w:rPr>
             <w:rStyle w:val="Hyperlnk"/>
@@ -4003,7 +3960,7 @@
       <w:r>
         <w:t xml:space="preserve">] </w:t>
       </w:r>
-      <w:hyperlink r:id="rId23" w:history="1">
+      <w:hyperlink r:id="rId24" w:history="1">
         <w:r>
           <w:rPr>
             <w:rStyle w:val="Hyperlnk"/>
@@ -4027,7 +3984,7 @@
       </w:r>
     </w:p>
     <w:p>
-      <w:hyperlink r:id="rId24" w:history="1">
+      <w:hyperlink r:id="rId25" w:history="1">
         <w:r>
           <w:rPr>
             <w:rStyle w:val="Hyperlnk"/>
@@ -4051,7 +4008,7 @@
       </w:r>
     </w:p>
     <w:p>
-      <w:hyperlink r:id="rId25" w:history="1">
+      <w:hyperlink r:id="rId26" w:history="1">
         <w:r>
           <w:rPr>
             <w:rStyle w:val="Hyperlnk"/>
@@ -4075,7 +4032,7 @@
       </w:r>
     </w:p>
     <w:p>
-      <w:hyperlink r:id="rId26" w:history="1">
+      <w:hyperlink r:id="rId27" w:history="1">
         <w:r>
           <w:rPr>
             <w:rStyle w:val="Hyperlnk"/>
@@ -4096,7 +4053,7 @@
       </w:r>
     </w:p>
     <w:p>
-      <w:hyperlink r:id="rId27" w:history="1">
+      <w:hyperlink r:id="rId28" w:history="1">
         <w:r>
           <w:rPr>
             <w:rStyle w:val="Hyperlnk"/>
@@ -4110,8 +4067,8 @@
     </w:p>
     <w:p/>
     <w:sectPr>
-      <w:headerReference w:type="default" r:id="rId28"/>
-      <w:footerReference w:type="default" r:id="rId29"/>
+      <w:headerReference w:type="default" r:id="rId29"/>
+      <w:footerReference w:type="default" r:id="rId30"/>
       <w:pgSz w:w="11906" w:h="16838"/>
       <w:pgMar w:top="1440" w:right="1440" w:bottom="1440" w:left="1440" w:header="708" w:footer="708" w:gutter="0"/>
       <w:cols w:space="708"/>
@@ -5547,6 +5504,7 @@
   <w:style w:type="character" w:default="1" w:styleId="Standardstycketeckensnitt">
     <w:name w:val="Default Paragraph Font"/>
     <w:uiPriority w:val="1"/>
+    <w:semiHidden/>
     <w:unhideWhenUsed/>
   </w:style>
   <w:style w:type="table" w:default="1" w:styleId="Normaltabell">

</xml_diff>

<commit_message>
zsdrone bombs analysis added
</commit_message>
<xml_diff>
--- a/Documentation/Requirements and Mission Definition.docx
+++ b/Documentation/Requirements and Mission Definition.docx
@@ -3495,13 +3495,8 @@
           <w:numId w:val="6"/>
         </w:numPr>
       </w:pPr>
-      <w:proofErr w:type="spellStart"/>
-      <w:r>
-        <w:t>ZSdrone</w:t>
-      </w:r>
-      <w:proofErr w:type="spellEnd"/>
-      <w:r>
-        <w:t xml:space="preserve"> SLM-P-10</w:t>
+      <w:r>
+        <w:t>ZSdrone SLM-P-10</w:t>
       </w:r>
       <w:r>
         <w:t xml:space="preserve"> and </w:t>
@@ -3598,6 +3593,58 @@
               <w:t>fire extinguishing agent:6.5kg</w:t>
             </w:r>
           </w:p>
+          <w:p>
+            <w:pPr>
+              <w:rPr>
+                <w:noProof/>
+              </w:rPr>
+            </w:pPr>
+            <w:r>
+              <w:rPr>
+                <w:noProof/>
+              </w:rPr>
+              <w:t>overall weight: 9.5kg</w:t>
+            </w:r>
+          </w:p>
+          <w:p>
+            <w:pPr>
+              <w:rPr>
+                <w:noProof/>
+              </w:rPr>
+            </w:pPr>
+            <w:r>
+              <w:rPr>
+                <w:noProof/>
+              </w:rPr>
+              <w:t>for 200kg payload -&gt; 21 bombs</w:t>
+            </w:r>
+          </w:p>
+          <w:p>
+            <w:pPr>
+              <w:rPr>
+                <w:noProof/>
+              </w:rPr>
+            </w:pPr>
+            <w:r>
+              <w:rPr>
+                <w:noProof/>
+              </w:rPr>
+              <w:t>volume for 21 devices: ~0.36m^3</w:t>
+            </w:r>
+          </w:p>
+          <w:p>
+            <w:pPr>
+              <w:rPr>
+                <w:noProof/>
+              </w:rPr>
+            </w:pPr>
+            <w:r>
+              <w:rPr>
+                <w:noProof/>
+              </w:rPr>
+              <w:t>total area covered: ~1050m^2</w:t>
+            </w:r>
+          </w:p>
         </w:tc>
         <w:tc>
           <w:tcPr>
@@ -3663,6 +3710,107 @@
               <w:t>fire extinguishing agent:23kg</w:t>
             </w:r>
           </w:p>
+          <w:p>
+            <w:pPr>
+              <w:rPr>
+                <w:noProof/>
+              </w:rPr>
+            </w:pPr>
+            <w:r>
+              <w:rPr>
+                <w:noProof/>
+              </w:rPr>
+              <w:t xml:space="preserve">overall weight: </w:t>
+            </w:r>
+            <w:r>
+              <w:rPr>
+                <w:noProof/>
+              </w:rPr>
+              <w:t>24.8</w:t>
+            </w:r>
+            <w:r>
+              <w:rPr>
+                <w:noProof/>
+              </w:rPr>
+              <w:t>kg</w:t>
+            </w:r>
+          </w:p>
+          <w:p>
+            <w:pPr>
+              <w:rPr>
+                <w:noProof/>
+              </w:rPr>
+            </w:pPr>
+            <w:r>
+              <w:rPr>
+                <w:noProof/>
+              </w:rPr>
+              <w:t>for 200kg payload -&gt; 21 bombs</w:t>
+            </w:r>
+          </w:p>
+          <w:p>
+            <w:pPr>
+              <w:rPr>
+                <w:noProof/>
+              </w:rPr>
+            </w:pPr>
+            <w:r>
+              <w:rPr>
+                <w:noProof/>
+              </w:rPr>
+              <w:t xml:space="preserve">volume for </w:t>
+            </w:r>
+            <w:r>
+              <w:rPr>
+                <w:noProof/>
+              </w:rPr>
+              <w:t>8</w:t>
+            </w:r>
+            <w:r>
+              <w:rPr>
+                <w:noProof/>
+              </w:rPr>
+              <w:t xml:space="preserve"> devices: ~0.3</w:t>
+            </w:r>
+            <w:r>
+              <w:rPr>
+                <w:noProof/>
+              </w:rPr>
+              <w:t>4</w:t>
+            </w:r>
+            <w:r>
+              <w:rPr>
+                <w:noProof/>
+              </w:rPr>
+              <w:t>m^</w:t>
+            </w:r>
+            <w:r>
+              <w:rPr>
+                <w:noProof/>
+              </w:rPr>
+              <w:t>3</w:t>
+            </w:r>
+          </w:p>
+          <w:p>
+            <w:pPr>
+              <w:rPr>
+                <w:noProof/>
+              </w:rPr>
+            </w:pPr>
+            <w:r>
+              <w:rPr>
+                <w:noProof/>
+              </w:rPr>
+              <w:t>total area covered: ~1000m^2</w:t>
+            </w:r>
+          </w:p>
+          <w:p>
+            <w:pPr>
+              <w:rPr>
+                <w:noProof/>
+              </w:rPr>
+            </w:pPr>
+          </w:p>
         </w:tc>
       </w:tr>
     </w:tbl>
@@ -3679,7 +3827,13 @@
         </w:rPr>
       </w:pPr>
       <w:r>
-        <w:t>Lot more data available on website</w:t>
+        <w:t>M</w:t>
+      </w:r>
+      <w:r>
+        <w:t>ore data available on website</w:t>
+      </w:r>
+      <w:r>
+        <w:t>:</w:t>
       </w:r>
     </w:p>
     <w:p>
@@ -3693,7 +3847,19 @@
         <w:rPr>
           <w:noProof/>
         </w:rPr>
-        <w:t xml:space="preserve">6.5 kg: </w:t>
+        <w:t>6.5 kg</w:t>
+      </w:r>
+      <w:r>
+        <w:rPr>
+          <w:noProof/>
+        </w:rPr>
+        <w:t xml:space="preserve"> powder</w:t>
+      </w:r>
+      <w:r>
+        <w:rPr>
+          <w:noProof/>
+        </w:rPr>
+        <w:t xml:space="preserve">: </w:t>
       </w:r>
       <w:hyperlink r:id="rId16" w:history="1">
         <w:r>
@@ -3710,7 +3876,19 @@
         <w:ind w:firstLine="720"/>
       </w:pPr>
       <w:r>
-        <w:t xml:space="preserve">23kg: </w:t>
+        <w:t>23kg</w:t>
+      </w:r>
+      <w:r>
+        <w:t xml:space="preserve"> </w:t>
+      </w:r>
+      <w:r>
+        <w:rPr>
+          <w:noProof/>
+        </w:rPr>
+        <w:t>powder</w:t>
+      </w:r>
+      <w:r>
+        <w:t xml:space="preserve">: </w:t>
       </w:r>
       <w:hyperlink r:id="rId17" w:history="1">
         <w:r>
@@ -3814,14 +3992,8 @@
           <w:numId w:val="6"/>
         </w:numPr>
       </w:pPr>
-      <w:proofErr w:type="spellStart"/>
-      <w:r>
-        <w:lastRenderedPageBreak/>
-        <w:t>JingHong</w:t>
-      </w:r>
-      <w:proofErr w:type="spellEnd"/>
-      <w:r>
-        <w:t xml:space="preserve"> Water-Based Fire-Extinguishing Bomb</w:t>
+      <w:r>
+        <w:t>JingHong Water-Based Fire-Extinguishing Bomb</w:t>
       </w:r>
       <w:r>
         <w:rPr>
@@ -5303,6 +5475,7 @@
   <w:style w:type="paragraph" w:default="1" w:styleId="Normal">
     <w:name w:val="Normal"/>
     <w:qFormat/>
+    <w:rsid w:val="008B6511"/>
   </w:style>
   <w:style w:type="paragraph" w:styleId="Rubrik1">
     <w:name w:val="heading 1"/>

</xml_diff>